<commit_message>
Atualiza documento de prints com as telas novas e adiciona modo demo
Documento de prints agora com 11 figuras (inclui Insights IA e Monitoramento). Pagina de Insights ganha modo demonstracao (?demo) que mostra resultados de exemplo sem precisar do backend, util para a banca. Co-Authored-By: Claude Opus 4.8 <noreply@anthropic.com>
</commit_message>
<xml_diff>
--- a/docs/Remio - Prints das Principais Telas.docx
+++ b/docs/Remio - Prints das Principais Telas.docx
@@ -122,7 +122,7 @@
         </w:rPr>
         <w:t xml:space="preserve">Acesse o site: </w:t>
       </w:r>
-      <w:hyperlink w:history="1" r:id="rIdfh9jxdmsu9_zby668x064">
+      <w:hyperlink w:history="1" r:id="rIdj2evmhlhw3up6df6wp9hj">
         <w:r>
           <w:rPr>
             <w:rStyle w:val="Hyperlink"/>
@@ -201,7 +201,7 @@
       <w:r>
         <w:drawing>
           <wp:inline distT="0" distB="0" distL="0" distR="0">
-            <wp:extent cx="4343400" cy="7239000"/>
+            <wp:extent cx="3886200" cy="6477000"/>
             <wp:effectExtent t="0" r="0" b="0" l="0"/>
             <wp:docPr id="1" name="figura-1" descr="Tela de entrada da plataforma. Apresenta a busca principal por serviços, os atalhos para as categorias mais procuradas, o banner de publicação de pedidos, a grade completa de serviços domésticos, os profissionais em destaque e a seção &quot;como funciona&quot;, que explica a jornada em três passos." title="Página inicial (Home)"/>
             <wp:cNvGraphicFramePr>
@@ -226,7 +226,7 @@
                   <pic:spPr bwMode="auto">
                     <a:xfrm>
                       <a:off x="0" y="0"/>
-                      <a:ext cx="4343400" cy="7239000"/>
+                      <a:ext cx="3886200" cy="6477000"/>
                     </a:xfrm>
                     <a:prstGeom prst="rect">
                       <a:avLst/>
@@ -275,7 +275,7 @@
       <w:r>
         <w:drawing>
           <wp:inline distT="0" distB="0" distL="0" distR="0">
-            <wp:extent cx="5791200" cy="7239000"/>
+            <wp:extent cx="5181600" cy="6477000"/>
             <wp:effectExtent t="0" r="0" b="0" l="0"/>
             <wp:docPr id="1" name="figura-2" descr="Listagem de profissionais disponíveis com painel de filtros. O usuário pode refinar a busca por categoria, cidade, nota mínima e faixa de preço ($, $$ ou $$$), recurso inspirado em aplicativos como o iFood. Cada cartão exibe o selo de verificado, o badge PRO, a avaliação e a localização do profissional." title="Busca de profissionais"/>
             <wp:cNvGraphicFramePr>
@@ -300,7 +300,7 @@
                   <pic:spPr bwMode="auto">
                     <a:xfrm>
                       <a:off x="0" y="0"/>
-                      <a:ext cx="5791200" cy="7239000"/>
+                      <a:ext cx="5181600" cy="6477000"/>
                     </a:xfrm>
                     <a:prstGeom prst="rect">
                       <a:avLst/>
@@ -349,7 +349,7 @@
       <w:r>
         <w:drawing>
           <wp:inline distT="0" distB="0" distL="0" distR="0">
-            <wp:extent cx="5943600" cy="7019925"/>
+            <wp:extent cx="5486400" cy="6477000"/>
             <wp:effectExtent t="0" r="0" b="0" l="0"/>
             <wp:docPr id="1" name="figura-3" descr="Página detalhada do prestador de serviço, com biografia, estatísticas, galeria de trabalhos realizados, qualificações e avaliações de clientes anteriores. A partir desta tela, o usuário inicia a solicitação de orçamento e visualiza o selo de Pagamento Protegido." title="Perfil do profissional"/>
             <wp:cNvGraphicFramePr>
@@ -374,7 +374,7 @@
                   <pic:spPr bwMode="auto">
                     <a:xfrm>
                       <a:off x="0" y="0"/>
-                      <a:ext cx="5943600" cy="7019925"/>
+                      <a:ext cx="5486400" cy="6477000"/>
                     </a:xfrm>
                     <a:prstGeom prst="rect">
                       <a:avLst/>
@@ -423,7 +423,7 @@
       <w:r>
         <w:drawing>
           <wp:inline distT="0" distB="0" distL="0" distR="0">
-            <wp:extent cx="5791200" cy="7239000"/>
+            <wp:extent cx="5181600" cy="6477000"/>
             <wp:effectExtent t="0" r="0" b="0" l="0"/>
             <wp:docPr id="1" name="figura-4" descr="Acompanhamento dos pedidos do cliente, organizados por status: aguardando orçamento, orçamento recebido, agendado, concluído e avaliado. É nesta tela que ocorre o fluxo de Pagamento Protegido, no qual o valor fica retido pela plataforma até a confirmação da conclusão do serviço." title="Meus pedidos"/>
             <wp:cNvGraphicFramePr>
@@ -448,7 +448,7 @@
                   <pic:spPr bwMode="auto">
                     <a:xfrm>
                       <a:off x="0" y="0"/>
-                      <a:ext cx="5791200" cy="7239000"/>
+                      <a:ext cx="5181600" cy="6477000"/>
                     </a:xfrm>
                     <a:prstGeom prst="rect">
                       <a:avLst/>
@@ -719,7 +719,7 @@
       <w:r>
         <w:drawing>
           <wp:inline distT="0" distB="0" distL="0" distR="0">
-            <wp:extent cx="4962525" cy="7239000"/>
+            <wp:extent cx="4438650" cy="6477000"/>
             <wp:effectExtent t="0" r="0" b="0" l="0"/>
             <wp:docPr id="1" name="figura-8" descr="Dashboard do prestador, voltado à gestão do seu desempenho: faturamento mensal, serviços concluídos, nota média e taxa de conversão de orçamentos. Inclui o comparativo entre o preço do profissional e a média da categoria e um mapa de calor com os horários de pico da demanda." title="Painel de BI — Prestador"/>
             <wp:cNvGraphicFramePr>
@@ -744,7 +744,7 @@
                   <pic:spPr bwMode="auto">
                     <a:xfrm>
                       <a:off x="0" y="0"/>
-                      <a:ext cx="4962525" cy="7239000"/>
+                      <a:ext cx="4438650" cy="6477000"/>
                     </a:xfrm>
                     <a:prstGeom prst="rect">
                       <a:avLst/>
@@ -843,6 +843,154 @@
           <w:szCs w:val="20"/>
         </w:rPr>
         <w:t xml:space="preserve">Dashboard da empresa parceira, com os resultados da loja dentro do ecossistema Remio: indicações recebidas, contatos gerados, taxa de conversão e avaliação, além do funil que acompanha a jornada da indicação até a venda estimada.</w:t>
+      </w:r>
+    </w:p>
+    <w:p>
+      <w:r>
+        <w:br w:type="page"/>
+      </w:r>
+    </w:p>
+    <w:p>
+      <w:pPr>
+        <w:pStyle w:val="Heading1"/>
+        <w:spacing w:after="160" w:before="0"/>
+      </w:pPr>
+      <w:r>
+        <w:t xml:space="preserve">Figura 10 — Insights de IA</w:t>
+      </w:r>
+    </w:p>
+    <w:p>
+      <w:pPr>
+        <w:spacing w:after="120"/>
+        <w:jc w:val="center"/>
+      </w:pPr>
+      <w:r>
+        <w:drawing>
+          <wp:inline distT="0" distB="0" distL="0" distR="0">
+            <wp:extent cx="5486400" cy="6477000"/>
+            <wp:effectExtent t="0" r="0" b="0" l="0"/>
+            <wp:docPr id="1" name="figura-10" descr="Tela que analisa as avaliações dos clientes usando a API da Claude (Anthropic). A inteligência artificial classifica o sentimento, calcula um índice de satisfação, identifica os temas recorrentes e gera pontos fortes, pontos de melhoria e sugestões para a plataforma — conectando o protótipo aos fluxos de IA descritos na arquitetura." title="Insights de IA"/>
+            <wp:cNvGraphicFramePr>
+              <a:graphicFrameLocks xmlns:a="http://schemas.openxmlformats.org/drawingml/2006/main" noChangeAspect="1"/>
+            </wp:cNvGraphicFramePr>
+            <a:graphic xmlns:a="http://schemas.openxmlformats.org/drawingml/2006/main">
+              <a:graphicData uri="http://schemas.openxmlformats.org/drawingml/2006/picture">
+                <pic:pic xmlns:pic="http://schemas.openxmlformats.org/drawingml/2006/picture">
+                  <pic:nvPicPr>
+                    <pic:cNvPr id="0" name="" descr=""/>
+                    <pic:cNvPicPr>
+                      <a:picLocks noChangeAspect="1" noChangeArrowheads="1"/>
+                    </pic:cNvPicPr>
+                  </pic:nvPicPr>
+                  <pic:blipFill>
+                    <a:blip r:embed="rId17" cstate="none"/>
+                    <a:srcRect/>
+                    <a:stretch>
+                      <a:fillRect/>
+                    </a:stretch>
+                  </pic:blipFill>
+                  <pic:spPr bwMode="auto">
+                    <a:xfrm>
+                      <a:off x="0" y="0"/>
+                      <a:ext cx="5486400" cy="6477000"/>
+                    </a:xfrm>
+                    <a:prstGeom prst="rect">
+                      <a:avLst/>
+                    </a:prstGeom>
+                  </pic:spPr>
+                </pic:pic>
+              </a:graphicData>
+            </a:graphic>
+          </wp:inline>
+        </w:drawing>
+      </w:r>
+    </w:p>
+    <w:p>
+      <w:pPr>
+        <w:spacing w:after="0" w:line="276"/>
+        <w:jc w:val="both"/>
+      </w:pPr>
+      <w:r>
+        <w:rPr>
+          <w:color w:val="4B5563"/>
+          <w:sz w:val="20"/>
+          <w:szCs w:val="20"/>
+        </w:rPr>
+        <w:t xml:space="preserve">Tela que analisa as avaliações dos clientes usando a API da Claude (Anthropic). A inteligência artificial classifica o sentimento, calcula um índice de satisfação, identifica os temas recorrentes e gera pontos fortes, pontos de melhoria e sugestões para a plataforma — conectando o protótipo aos fluxos de IA descritos na arquitetura.</w:t>
+      </w:r>
+    </w:p>
+    <w:p>
+      <w:r>
+        <w:br w:type="page"/>
+      </w:r>
+    </w:p>
+    <w:p>
+      <w:pPr>
+        <w:pStyle w:val="Heading1"/>
+        <w:spacing w:after="160" w:before="0"/>
+      </w:pPr>
+      <w:r>
+        <w:t xml:space="preserve">Figura 11 — Monitoramento e observabilidade</w:t>
+      </w:r>
+    </w:p>
+    <w:p>
+      <w:pPr>
+        <w:spacing w:after="120"/>
+        <w:jc w:val="center"/>
+      </w:pPr>
+      <w:r>
+        <w:drawing>
+          <wp:inline distT="0" distB="0" distL="0" distR="0">
+            <wp:extent cx="4552950" cy="6477000"/>
+            <wp:effectExtent t="0" r="0" b="0" l="0"/>
+            <wp:docPr id="1" name="figura-11" descr="Painel de observabilidade da plataforma: indicadores de saúde do sistema (disponibilidade, latência, taxa de erro), gráficos de latência e de requisições, verificação de saúde dos serviços (health checks), checagem de qualidade dos dados do ETL e o repositório de erros, que captura automaticamente as falhas de JavaScript do site." title="Monitoramento e observabilidade"/>
+            <wp:cNvGraphicFramePr>
+              <a:graphicFrameLocks xmlns:a="http://schemas.openxmlformats.org/drawingml/2006/main" noChangeAspect="1"/>
+            </wp:cNvGraphicFramePr>
+            <a:graphic xmlns:a="http://schemas.openxmlformats.org/drawingml/2006/main">
+              <a:graphicData uri="http://schemas.openxmlformats.org/drawingml/2006/picture">
+                <pic:pic xmlns:pic="http://schemas.openxmlformats.org/drawingml/2006/picture">
+                  <pic:nvPicPr>
+                    <pic:cNvPr id="0" name="" descr=""/>
+                    <pic:cNvPicPr>
+                      <a:picLocks noChangeAspect="1" noChangeArrowheads="1"/>
+                    </pic:cNvPicPr>
+                  </pic:nvPicPr>
+                  <pic:blipFill>
+                    <a:blip r:embed="rId18" cstate="none"/>
+                    <a:srcRect/>
+                    <a:stretch>
+                      <a:fillRect/>
+                    </a:stretch>
+                  </pic:blipFill>
+                  <pic:spPr bwMode="auto">
+                    <a:xfrm>
+                      <a:off x="0" y="0"/>
+                      <a:ext cx="4552950" cy="6477000"/>
+                    </a:xfrm>
+                    <a:prstGeom prst="rect">
+                      <a:avLst/>
+                    </a:prstGeom>
+                  </pic:spPr>
+                </pic:pic>
+              </a:graphicData>
+            </a:graphic>
+          </wp:inline>
+        </w:drawing>
+      </w:r>
+    </w:p>
+    <w:p>
+      <w:pPr>
+        <w:spacing w:after="0" w:line="276"/>
+        <w:jc w:val="both"/>
+      </w:pPr>
+      <w:r>
+        <w:rPr>
+          <w:color w:val="4B5563"/>
+          <w:sz w:val="20"/>
+          <w:szCs w:val="20"/>
+        </w:rPr>
+        <w:t xml:space="preserve">Painel de observabilidade da plataforma: indicadores de saúde do sistema (disponibilidade, latência, taxa de erro), gráficos de latência e de requisições, verificação de saúde dos serviços (health checks), checagem de qualidade dos dados do ETL e o repositório de erros, que captura automaticamente as falhas de JavaScript do site.</w:t>
       </w:r>
     </w:p>
     <w:sectPr>

</xml_diff>